<commit_message>
update Computer Networks (B) to three-part assessment (20/20/60); add change diff and replacement draft
</commit_message>
<xml_diff>
--- a/course/计算机网络（B）/2025/大纲/25JX21801-计算机网络（B）-课程教学大纲.docx
+++ b/course/计算机网络（B）/2025/大纲/25JX21801-计算机网络（B）-课程教学大纲.docx
@@ -3858,7 +3858,7 @@
         <w:rPr>
           <w:rFonts w:ascii="Times New Roman" w:hAnsi="Times New Roman" w:cs="Times New Roman" w:eastAsia="宋体"/>
         </w:rPr>
-        <w:t>本课程采用考查。总评由平时学习与课堂分析20%、协议与报文分析作业30%、网络设计与故障分析报告40%、个人核验与答辩10%构成。下表各考核列百分比为该项考核内部的教学内容分配，各列分别合计100%。</w:t>
+        <w:t>本课程采用考查。总评由平时学习与课堂分析20%、课程作业（协议与报文分析）20%、期末综合考查60%构成。期末综合考查采用网络设计与故障分析综合报告和个人核验答辩，不安排期末笔试或机考。下表各考核列百分比为该项考核内部的教学内容分配，各列分别合计100%。</w:t>
       </w:r>
     </w:p>
     <w:tbl>
@@ -3881,7 +3881,6 @@
         <w:gridCol w:w="746"/>
         <w:gridCol w:w="746"/>
         <w:gridCol w:w="746"/>
-        <w:gridCol w:w="959"/>
         <w:gridCol w:w="959"/>
         <w:gridCol w:w="959"/>
         <w:gridCol w:w="959"/>
@@ -4018,7 +4017,7 @@
                 <w:b/>
                 <w:sz w:val="15"/>
               </w:rPr>
-              <w:t>平时分析（20%）</w:t>
+              <w:t>平时学习与课堂分析（20%）</w:t>
             </w:r>
           </w:p>
         </w:tc>
@@ -4044,7 +4043,7 @@
                 <w:b/>
                 <w:sz w:val="15"/>
               </w:rPr>
-              <w:t>协议作业（30%）</w:t>
+              <w:t>课程作业（20%）</w:t>
             </w:r>
           </w:p>
         </w:tc>
@@ -4070,33 +4069,7 @@
                 <w:b/>
                 <w:sz w:val="15"/>
               </w:rPr>
-              <w:t>网络报告（40%）</w:t>
-            </w:r>
-          </w:p>
-        </w:tc>
-        <w:tc>
-          <w:tcPr>
-            <w:tcW w:type="dxa" w:w="959"/>
-            <w:tcMar>
-              <w:top w:w="80" w:type="dxa"/>
-              <w:start w:w="70" w:type="dxa"/>
-              <w:bottom w:w="80" w:type="dxa"/>
-              <w:end w:w="70" w:type="dxa"/>
-            </w:tcMar>
-            <w:vAlign w:val="center"/>
-          </w:tcPr>
-          <w:p>
-            <w:pPr>
-              <w:spacing w:line="240" w:lineRule="auto" w:before="0" w:after="0"/>
-              <w:jc w:val="center"/>
-            </w:pPr>
-            <w:r>
-              <w:rPr>
-                <w:rFonts w:ascii="Times New Roman" w:hAnsi="Times New Roman" w:cs="Times New Roman" w:eastAsia="宋体"/>
-                <w:b/>
-                <w:sz w:val="15"/>
-              </w:rPr>
-              <w:t>个人核验（10%）</w:t>
+              <w:t>期末综合考查（60%）</w:t>
             </w:r>
           </w:p>
         </w:tc>
@@ -4229,32 +4202,6 @@
                 <w:sz w:val="15"/>
               </w:rPr>
               <w:t>0</w:t>
-            </w:r>
-          </w:p>
-        </w:tc>
-        <w:tc>
-          <w:tcPr>
-            <w:tcW w:type="dxa" w:w="959"/>
-            <w:vAlign w:val="center"/>
-            <w:tcMar>
-              <w:top w:w="80" w:type="dxa"/>
-              <w:start w:w="70" w:type="dxa"/>
-              <w:bottom w:w="80" w:type="dxa"/>
-              <w:end w:w="70" w:type="dxa"/>
-            </w:tcMar>
-          </w:tcPr>
-          <w:p>
-            <w:pPr>
-              <w:spacing w:line="240" w:lineRule="auto" w:before="0" w:after="0"/>
-              <w:jc w:val="center"/>
-            </w:pPr>
-            <w:r>
-              <w:rPr>
-                <w:rFonts w:ascii="Times New Roman" w:hAnsi="Times New Roman" w:cs="Times New Roman" w:eastAsia="宋体"/>
-                <w:b w:val="0"/>
-                <w:sz w:val="15"/>
-              </w:rPr>
-              <w:t>10%</w:t>
             </w:r>
           </w:p>
         </w:tc>
@@ -4548,32 +4495,6 @@
         </w:tc>
         <w:tc>
           <w:tcPr>
-            <w:tcW w:type="dxa" w:w="959"/>
-            <w:vAlign w:val="center"/>
-            <w:tcMar>
-              <w:top w:w="80" w:type="dxa"/>
-              <w:start w:w="70" w:type="dxa"/>
-              <w:bottom w:w="80" w:type="dxa"/>
-              <w:end w:w="70" w:type="dxa"/>
-            </w:tcMar>
-          </w:tcPr>
-          <w:p>
-            <w:pPr>
-              <w:spacing w:line="240" w:lineRule="auto" w:before="0" w:after="0"/>
-              <w:jc w:val="center"/>
-            </w:pPr>
-            <w:r>
-              <w:rPr>
-                <w:rFonts w:ascii="Times New Roman" w:hAnsi="Times New Roman" w:cs="Times New Roman" w:eastAsia="宋体"/>
-                <w:b w:val="0"/>
-                <w:sz w:val="15"/>
-              </w:rPr>
-              <w:t>15%</w:t>
-            </w:r>
-          </w:p>
-        </w:tc>
-        <w:tc>
-          <w:tcPr>
             <w:tcW w:type="dxa" w:w="1435"/>
             <w:vAlign w:val="center"/>
             <w:tcMar>
@@ -4701,32 +4622,6 @@
                 <w:sz w:val="15"/>
               </w:rPr>
               <w:t>0</w:t>
-            </w:r>
-          </w:p>
-        </w:tc>
-        <w:tc>
-          <w:tcPr>
-            <w:tcW w:type="dxa" w:w="959"/>
-            <w:vAlign w:val="center"/>
-            <w:tcMar>
-              <w:top w:w="80" w:type="dxa"/>
-              <w:start w:w="70" w:type="dxa"/>
-              <w:bottom w:w="80" w:type="dxa"/>
-              <w:end w:w="70" w:type="dxa"/>
-            </w:tcMar>
-          </w:tcPr>
-          <w:p>
-            <w:pPr>
-              <w:spacing w:line="240" w:lineRule="auto" w:before="0" w:after="0"/>
-              <w:jc w:val="center"/>
-            </w:pPr>
-            <w:r>
-              <w:rPr>
-                <w:rFonts w:ascii="Times New Roman" w:hAnsi="Times New Roman" w:cs="Times New Roman" w:eastAsia="宋体"/>
-                <w:b w:val="0"/>
-                <w:sz w:val="15"/>
-              </w:rPr>
-              <w:t>25%</w:t>
             </w:r>
           </w:p>
         </w:tc>
@@ -5014,33 +4909,7 @@
                 <w:b w:val="0"/>
                 <w:sz w:val="15"/>
               </w:rPr>
-              <w:t>15%</w:t>
-            </w:r>
-          </w:p>
-        </w:tc>
-        <w:tc>
-          <w:tcPr>
-            <w:tcW w:type="dxa" w:w="959"/>
-            <w:vAlign w:val="center"/>
-            <w:tcMar>
-              <w:top w:w="80" w:type="dxa"/>
-              <w:start w:w="70" w:type="dxa"/>
-              <w:bottom w:w="80" w:type="dxa"/>
-              <w:end w:w="70" w:type="dxa"/>
-            </w:tcMar>
-          </w:tcPr>
-          <w:p>
-            <w:pPr>
-              <w:spacing w:line="240" w:lineRule="auto" w:before="0" w:after="0"/>
-              <w:jc w:val="center"/>
-            </w:pPr>
-            <w:r>
-              <w:rPr>
-                <w:rFonts w:ascii="Times New Roman" w:hAnsi="Times New Roman" w:cs="Times New Roman" w:eastAsia="宋体"/>
-                <w:b w:val="0"/>
-                <w:sz w:val="15"/>
-              </w:rPr>
-              <w:t>20%</w:t>
+              <w:t>16%</w:t>
             </w:r>
           </w:p>
         </w:tc>
@@ -5173,32 +5042,6 @@
                 <w:sz w:val="15"/>
               </w:rPr>
               <w:t>0</w:t>
-            </w:r>
-          </w:p>
-        </w:tc>
-        <w:tc>
-          <w:tcPr>
-            <w:tcW w:type="dxa" w:w="959"/>
-            <w:vAlign w:val="center"/>
-            <w:tcMar>
-              <w:top w:w="80" w:type="dxa"/>
-              <w:start w:w="70" w:type="dxa"/>
-              <w:bottom w:w="80" w:type="dxa"/>
-              <w:end w:w="70" w:type="dxa"/>
-            </w:tcMar>
-          </w:tcPr>
-          <w:p>
-            <w:pPr>
-              <w:spacing w:line="240" w:lineRule="auto" w:before="0" w:after="0"/>
-              <w:jc w:val="center"/>
-            </w:pPr>
-            <w:r>
-              <w:rPr>
-                <w:rFonts w:ascii="Times New Roman" w:hAnsi="Times New Roman" w:cs="Times New Roman" w:eastAsia="宋体"/>
-                <w:b w:val="0"/>
-                <w:sz w:val="15"/>
-              </w:rPr>
-              <w:t>15%</w:t>
             </w:r>
           </w:p>
         </w:tc>
@@ -5486,33 +5329,7 @@
                 <w:b w:val="0"/>
                 <w:sz w:val="15"/>
               </w:rPr>
-              <w:t>20%</w:t>
-            </w:r>
-          </w:p>
-        </w:tc>
-        <w:tc>
-          <w:tcPr>
-            <w:tcW w:type="dxa" w:w="959"/>
-            <w:vAlign w:val="center"/>
-            <w:tcMar>
-              <w:top w:w="80" w:type="dxa"/>
-              <w:start w:w="70" w:type="dxa"/>
-              <w:bottom w:w="80" w:type="dxa"/>
-              <w:end w:w="70" w:type="dxa"/>
-            </w:tcMar>
-          </w:tcPr>
-          <w:p>
-            <w:pPr>
-              <w:spacing w:line="240" w:lineRule="auto" w:before="0" w:after="0"/>
-              <w:jc w:val="center"/>
-            </w:pPr>
-            <w:r>
-              <w:rPr>
-                <w:rFonts w:ascii="Times New Roman" w:hAnsi="Times New Roman" w:cs="Times New Roman" w:eastAsia="宋体"/>
-                <w:b w:val="0"/>
-                <w:sz w:val="15"/>
-              </w:rPr>
-              <w:t>15%</w:t>
+              <w:t>19%</w:t>
             </w:r>
           </w:p>
         </w:tc>
@@ -5728,32 +5545,6 @@
         </w:tc>
         <w:tc>
           <w:tcPr>
-            <w:tcW w:type="dxa" w:w="959"/>
-            <w:vAlign w:val="center"/>
-            <w:tcMar>
-              <w:top w:w="80" w:type="dxa"/>
-              <w:start w:w="70" w:type="dxa"/>
-              <w:bottom w:w="80" w:type="dxa"/>
-              <w:end w:w="70" w:type="dxa"/>
-            </w:tcMar>
-          </w:tcPr>
-          <w:p>
-            <w:pPr>
-              <w:spacing w:line="240" w:lineRule="auto" w:before="0" w:after="0"/>
-              <w:jc w:val="center"/>
-            </w:pPr>
-            <w:r>
-              <w:rPr>
-                <w:rFonts w:ascii="Times New Roman" w:hAnsi="Times New Roman" w:cs="Times New Roman" w:eastAsia="宋体"/>
-                <w:b/>
-                <w:sz w:val="15"/>
-              </w:rPr>
-              <w:t>100%</w:t>
-            </w:r>
-          </w:p>
-        </w:tc>
-        <w:tc>
-          <w:tcPr>
             <w:tcW w:type="dxa" w:w="1435"/>
             <w:vAlign w:val="center"/>
             <w:tcMar>
@@ -5810,17 +5601,15 @@
     </w:p>
     <w:p>
       <w:pPr>
-        <w:spacing w:line="283" w:lineRule="auto" w:before="0" w:after="20"/>
+        <w:spacing w:line="283" w:lineRule="auto" w:before="0" w:after="0"/>
         <w:ind w:firstLine="420"/>
         <w:jc w:val="left"/>
       </w:pPr>
       <w:r>
         <w:rPr>
-          <w:rFonts w:ascii="Times New Roman" w:hAnsi="Times New Roman" w:eastAsia="宋体"/>
-          <w:b w:val="0"/>
-          <w:sz w:val="21"/>
+          <w:rFonts w:ascii="Times New Roman" w:hAnsi="Times New Roman" w:cs="Times New Roman" w:eastAsia="宋体"/>
         </w:rPr>
-        <w:t>考查。</w:t>
+        <w:t>考查（期末采用综合考查，不安排期末笔试或机考）。</w:t>
       </w:r>
     </w:p>
     <w:p>
@@ -5847,7 +5636,7 @@
         <w:rPr>
           <w:rFonts w:ascii="Times New Roman" w:hAnsi="Times New Roman" w:cs="Times New Roman" w:eastAsia="宋体"/>
         </w:rPr>
-        <w:t>各项按百分制评分。总评成绩=平时学习与课堂分析×20%＋协议与报文分析作业×30%＋网络设计与故障分析报告×40%＋个人核验与答辩×10%。培养方案未设置实验、上机和项目式学时，Wireshark抓包、网络仿真、Socket示例和路由配置仅作为课堂演示、课内分析或课后考核任务，不另计实践学时。所有网络探测、抓包和配置必须在授权环境、教师提供数据或隔离仿真环境中完成。</w:t>
+        <w:t>各项按百分制评分。总评成绩=平时学习与课堂分析×20%＋课程作业×20%＋期末综合考查×60%。课程作业以协议与报文分析为主要载体；期末综合考查由网络设计与故障分析综合报告和个人核验答辩共同组成，其中综合报告占期末综合考查的80%，个人核验答辩占20%。培养方案未设置实验、上机和项目式学时，Wireshark抓包、网络仿真、Socket示例和路由配置仅作为课堂演示、课内分析或课程作业材料，不另计实践学时。所有网络探测、抓包和配置必须在授权环境、教师提供数据或隔离仿真环境中完成。</w:t>
       </w:r>
     </w:p>
     <w:p>
@@ -6460,7 +6249,7 @@
         <w:rPr>
           <w:rFonts w:ascii="Times New Roman" w:hAnsi="Times New Roman" w:cs="Times New Roman" w:eastAsia="宋体"/>
         </w:rPr>
-        <w:t>（2）协议与报文分析作业评分标准</w:t>
+        <w:t>（2）课程作业评分标准</w:t>
       </w:r>
     </w:p>
     <w:tbl>
@@ -6502,15 +6291,14 @@
           </w:tcPr>
           <w:p>
             <w:pPr>
-              <w:spacing w:line="269" w:lineRule="auto" w:before="0" w:after="0"/>
+              <w:spacing w:line="240" w:lineRule="auto" w:before="0" w:after="0"/>
               <w:jc w:val="center"/>
             </w:pPr>
-            <w:r/>
             <w:r>
               <w:rPr>
-                <w:rFonts w:ascii="Times New Roman" w:hAnsi="Times New Roman" w:eastAsia="宋体"/>
+                <w:rFonts w:ascii="Times New Roman" w:hAnsi="Times New Roman" w:cs="Times New Roman" w:eastAsia="宋体"/>
                 <w:b/>
-                <w:sz w:val="17"/>
+                <w:sz w:val="16"/>
               </w:rPr>
               <w:t>考核内容</w:t>
             </w:r>
@@ -7348,7 +7136,7 @@
         <w:rPr>
           <w:rFonts w:ascii="Times New Roman" w:hAnsi="Times New Roman" w:cs="Times New Roman" w:eastAsia="宋体"/>
         </w:rPr>
-        <w:t>（3）网络设计与故障分析报告评分标准</w:t>
+        <w:t>（3）期末综合考查评分标准</w:t>
       </w:r>
     </w:p>
     <w:tbl>
@@ -7390,15 +7178,14 @@
           </w:tcPr>
           <w:p>
             <w:pPr>
-              <w:spacing w:line="269" w:lineRule="auto" w:before="0" w:after="0"/>
+              <w:spacing w:line="240" w:lineRule="auto" w:before="0" w:after="0"/>
               <w:jc w:val="center"/>
             </w:pPr>
-            <w:r/>
             <w:r>
               <w:rPr>
-                <w:rFonts w:ascii="Times New Roman" w:hAnsi="Times New Roman" w:eastAsia="宋体"/>
+                <w:rFonts w:ascii="Times New Roman" w:hAnsi="Times New Roman" w:cs="Times New Roman" w:eastAsia="宋体"/>
                 <w:b/>
-                <w:sz w:val="17"/>
+                <w:sz w:val="16"/>
               </w:rPr>
               <w:t>考核内容</w:t>
             </w:r>
@@ -7417,15 +7204,14 @@
           </w:tcPr>
           <w:p>
             <w:pPr>
-              <w:spacing w:line="269" w:lineRule="auto" w:before="0" w:after="0"/>
+              <w:spacing w:line="240" w:lineRule="auto" w:before="0" w:after="0"/>
               <w:jc w:val="center"/>
             </w:pPr>
-            <w:r/>
             <w:r>
               <w:rPr>
-                <w:rFonts w:ascii="Times New Roman" w:hAnsi="Times New Roman" w:eastAsia="宋体"/>
+                <w:rFonts w:ascii="Times New Roman" w:hAnsi="Times New Roman" w:cs="Times New Roman" w:eastAsia="宋体"/>
                 <w:b/>
-                <w:sz w:val="17"/>
+                <w:sz w:val="16"/>
               </w:rPr>
               <w:t>成绩占比</w:t>
             </w:r>
@@ -7444,15 +7230,14 @@
           </w:tcPr>
           <w:p>
             <w:pPr>
-              <w:spacing w:line="269" w:lineRule="auto" w:before="0" w:after="0"/>
+              <w:spacing w:line="240" w:lineRule="auto" w:before="0" w:after="0"/>
               <w:jc w:val="center"/>
             </w:pPr>
-            <w:r/>
             <w:r>
               <w:rPr>
-                <w:rFonts w:ascii="Times New Roman" w:hAnsi="Times New Roman" w:eastAsia="宋体"/>
+                <w:rFonts w:ascii="Times New Roman" w:hAnsi="Times New Roman" w:cs="Times New Roman" w:eastAsia="宋体"/>
                 <w:b/>
-                <w:sz w:val="17"/>
+                <w:sz w:val="16"/>
               </w:rPr>
               <w:t>评分要求</w:t>
             </w:r>
@@ -7471,15 +7256,14 @@
           </w:tcPr>
           <w:p>
             <w:pPr>
-              <w:spacing w:line="269" w:lineRule="auto" w:before="0" w:after="0"/>
+              <w:spacing w:line="240" w:lineRule="auto" w:before="0" w:after="0"/>
               <w:jc w:val="center"/>
             </w:pPr>
-            <w:r/>
             <w:r>
               <w:rPr>
-                <w:rFonts w:ascii="Times New Roman" w:hAnsi="Times New Roman" w:eastAsia="宋体"/>
+                <w:rFonts w:ascii="Times New Roman" w:hAnsi="Times New Roman" w:cs="Times New Roman" w:eastAsia="宋体"/>
                 <w:b/>
-                <w:sz w:val="17"/>
+                <w:sz w:val="16"/>
               </w:rPr>
               <w:t>课程目标</w:t>
             </w:r>
@@ -7509,7 +7293,7 @@
                 <w:b/>
                 <w:sz w:val="15"/>
               </w:rPr>
-              <w:t>需求、拓扑与性能指标</w:t>
+              <w:t>网络需求、拓扑与性能指标</w:t>
             </w:r>
           </w:p>
         </w:tc>
@@ -7561,7 +7345,7 @@
                 <w:b w:val="0"/>
                 <w:sz w:val="15"/>
               </w:rPr>
-              <w:t>明确用户/设备、通信关系、规模、带宽、时延、可用性和安全需求。</w:t>
+              <w:t>明确用户/设备、通信关系、规模、带宽、时延、可用性和安全需求，形成结构清楚的网络拓扑。</w:t>
             </w:r>
           </w:p>
         </w:tc>
@@ -7615,7 +7399,113 @@
                 <w:b/>
                 <w:sz w:val="15"/>
               </w:rPr>
-              <w:t>局域网与链路设计</w:t>
+              <w:t>局域网、IP地址与路由设计</w:t>
+            </w:r>
+          </w:p>
+        </w:tc>
+        <w:tc>
+          <w:tcPr>
+            <w:tcW w:type="dxa" w:w="900"/>
+            <w:vAlign w:val="center"/>
+            <w:tcMar>
+              <w:top w:w="80" w:type="dxa"/>
+              <w:start w:w="70" w:type="dxa"/>
+              <w:bottom w:w="80" w:type="dxa"/>
+              <w:end w:w="70" w:type="dxa"/>
+            </w:tcMar>
+          </w:tcPr>
+          <w:p>
+            <w:pPr>
+              <w:spacing w:line="240" w:lineRule="auto" w:before="0" w:after="0"/>
+              <w:jc w:val="center"/>
+            </w:pPr>
+            <w:r>
+              <w:rPr>
+                <w:rFonts w:ascii="Times New Roman" w:hAnsi="Times New Roman" w:cs="Times New Roman" w:eastAsia="宋体"/>
+                <w:b w:val="0"/>
+                <w:sz w:val="15"/>
+              </w:rPr>
+              <w:t>25%</w:t>
+            </w:r>
+          </w:p>
+        </w:tc>
+        <w:tc>
+          <w:tcPr>
+            <w:tcW w:type="dxa" w:w="5100"/>
+            <w:vAlign w:val="center"/>
+            <w:tcMar>
+              <w:top w:w="80" w:type="dxa"/>
+              <w:start w:w="70" w:type="dxa"/>
+              <w:bottom w:w="80" w:type="dxa"/>
+              <w:end w:w="70" w:type="dxa"/>
+            </w:tcMar>
+          </w:tcPr>
+          <w:p>
+            <w:pPr>
+              <w:spacing w:line="240" w:lineRule="auto" w:before="0" w:after="0"/>
+              <w:jc w:val="left"/>
+            </w:pPr>
+            <w:r>
+              <w:rPr>
+                <w:rFonts w:ascii="Times New Roman" w:hAnsi="Times New Roman" w:cs="Times New Roman" w:eastAsia="宋体"/>
+                <w:b w:val="0"/>
+                <w:sz w:val="15"/>
+              </w:rPr>
+              <w:t>交换、VLAN/WLAN、IPv4/IPv6地址、子网、网关、路由和必要的NAT设计正确，能够说明广播域、可达性和扩展性。</w:t>
+            </w:r>
+          </w:p>
+        </w:tc>
+        <w:tc>
+          <w:tcPr>
+            <w:tcW w:type="dxa" w:w="1354"/>
+            <w:vAlign w:val="center"/>
+            <w:tcMar>
+              <w:top w:w="80" w:type="dxa"/>
+              <w:start w:w="70" w:type="dxa"/>
+              <w:bottom w:w="80" w:type="dxa"/>
+              <w:end w:w="70" w:type="dxa"/>
+            </w:tcMar>
+          </w:tcPr>
+          <w:p>
+            <w:pPr>
+              <w:spacing w:line="240" w:lineRule="auto" w:before="0" w:after="0"/>
+              <w:jc w:val="center"/>
+            </w:pPr>
+            <w:r>
+              <w:rPr>
+                <w:rFonts w:ascii="Times New Roman" w:hAnsi="Times New Roman" w:cs="Times New Roman" w:eastAsia="宋体"/>
+                <w:b w:val="0"/>
+                <w:sz w:val="15"/>
+              </w:rPr>
+              <w:t>目标 1.2，1.3，2.2，2.3，3.2，3.3</w:t>
+            </w:r>
+          </w:p>
+        </w:tc>
+      </w:tr>
+      <w:tr>
+        <w:tc>
+          <w:tcPr>
+            <w:tcW w:type="dxa" w:w="1700"/>
+            <w:vAlign w:val="center"/>
+            <w:tcMar>
+              <w:top w:w="80" w:type="dxa"/>
+              <w:start w:w="70" w:type="dxa"/>
+              <w:bottom w:w="80" w:type="dxa"/>
+              <w:end w:w="70" w:type="dxa"/>
+            </w:tcMar>
+          </w:tcPr>
+          <w:p>
+            <w:pPr>
+              <w:spacing w:line="240" w:lineRule="auto" w:before="0" w:after="0"/>
+              <w:jc w:val="center"/>
+            </w:pPr>
+            <w:r>
+              <w:rPr>
+                <w:rFonts w:ascii="Times New Roman" w:hAnsi="Times New Roman" w:cs="Times New Roman" w:eastAsia="宋体"/>
+                <w:b/>
+                <w:sz w:val="15"/>
+              </w:rPr>
+              <w:t>运输层与应用服务设计</w:t>
             </w:r>
           </w:p>
         </w:tc>
@@ -7667,7 +7557,7 @@
                 <w:b w:val="0"/>
                 <w:sz w:val="15"/>
               </w:rPr>
-              <w:t>交换、VLAN/WLAN、地址接入和链路边界清楚，说明广播域和故障影响。</w:t>
+              <w:t>能依据应用特点说明TCP/UDP选择，正确描述DNS、Web、DHCP等服务依赖、端口和访问路径。</w:t>
             </w:r>
           </w:p>
         </w:tc>
@@ -7693,7 +7583,7 @@
                 <w:b w:val="0"/>
                 <w:sz w:val="15"/>
               </w:rPr>
-              <w:t>目标 1.2，2.2，3.2</w:t>
+              <w:t>目标 1.4，1.5，2.4，2.5，3.4，3.5</w:t>
             </w:r>
           </w:p>
         </w:tc>
@@ -7721,325 +7611,7 @@
                 <w:b/>
                 <w:sz w:val="15"/>
               </w:rPr>
-              <w:t>IP地址与路由设计</w:t>
-            </w:r>
-          </w:p>
-        </w:tc>
-        <w:tc>
-          <w:tcPr>
-            <w:tcW w:type="dxa" w:w="900"/>
-            <w:vAlign w:val="center"/>
-            <w:tcMar>
-              <w:top w:w="80" w:type="dxa"/>
-              <w:start w:w="70" w:type="dxa"/>
-              <w:bottom w:w="80" w:type="dxa"/>
-              <w:end w:w="70" w:type="dxa"/>
-            </w:tcMar>
-          </w:tcPr>
-          <w:p>
-            <w:pPr>
-              <w:spacing w:line="240" w:lineRule="auto" w:before="0" w:after="0"/>
-              <w:jc w:val="center"/>
-            </w:pPr>
-            <w:r>
-              <w:rPr>
-                <w:rFonts w:ascii="Times New Roman" w:hAnsi="Times New Roman" w:cs="Times New Roman" w:eastAsia="宋体"/>
-                <w:b w:val="0"/>
-                <w:sz w:val="15"/>
-              </w:rPr>
-              <w:t>25%</w:t>
-            </w:r>
-          </w:p>
-        </w:tc>
-        <w:tc>
-          <w:tcPr>
-            <w:tcW w:type="dxa" w:w="5100"/>
-            <w:vAlign w:val="center"/>
-            <w:tcMar>
-              <w:top w:w="80" w:type="dxa"/>
-              <w:start w:w="70" w:type="dxa"/>
-              <w:bottom w:w="80" w:type="dxa"/>
-              <w:end w:w="70" w:type="dxa"/>
-            </w:tcMar>
-          </w:tcPr>
-          <w:p>
-            <w:pPr>
-              <w:spacing w:line="240" w:lineRule="auto" w:before="0" w:after="0"/>
-              <w:jc w:val="left"/>
-            </w:pPr>
-            <w:r>
-              <w:rPr>
-                <w:rFonts w:ascii="Times New Roman" w:hAnsi="Times New Roman" w:cs="Times New Roman" w:eastAsia="宋体"/>
-                <w:b w:val="0"/>
-                <w:sz w:val="15"/>
-              </w:rPr>
-              <w:t>IPv4/IPv6地址、子网、网关、路由和必要的NAT规划正确且可扩展。</w:t>
-            </w:r>
-          </w:p>
-        </w:tc>
-        <w:tc>
-          <w:tcPr>
-            <w:tcW w:type="dxa" w:w="1354"/>
-            <w:vAlign w:val="center"/>
-            <w:tcMar>
-              <w:top w:w="80" w:type="dxa"/>
-              <w:start w:w="70" w:type="dxa"/>
-              <w:bottom w:w="80" w:type="dxa"/>
-              <w:end w:w="70" w:type="dxa"/>
-            </w:tcMar>
-          </w:tcPr>
-          <w:p>
-            <w:pPr>
-              <w:spacing w:line="240" w:lineRule="auto" w:before="0" w:after="0"/>
-              <w:jc w:val="center"/>
-            </w:pPr>
-            <w:r>
-              <w:rPr>
-                <w:rFonts w:ascii="Times New Roman" w:hAnsi="Times New Roman" w:cs="Times New Roman" w:eastAsia="宋体"/>
-                <w:b w:val="0"/>
-                <w:sz w:val="15"/>
-              </w:rPr>
-              <w:t>目标 1.3，2.3，3.3</w:t>
-            </w:r>
-          </w:p>
-        </w:tc>
-      </w:tr>
-      <w:tr>
-        <w:tc>
-          <w:tcPr>
-            <w:tcW w:type="dxa" w:w="1700"/>
-            <w:vAlign w:val="center"/>
-            <w:tcMar>
-              <w:top w:w="80" w:type="dxa"/>
-              <w:start w:w="70" w:type="dxa"/>
-              <w:bottom w:w="80" w:type="dxa"/>
-              <w:end w:w="70" w:type="dxa"/>
-            </w:tcMar>
-          </w:tcPr>
-          <w:p>
-            <w:pPr>
-              <w:spacing w:line="240" w:lineRule="auto" w:before="0" w:after="0"/>
-              <w:jc w:val="center"/>
-            </w:pPr>
-            <w:r>
-              <w:rPr>
-                <w:rFonts w:ascii="Times New Roman" w:hAnsi="Times New Roman" w:cs="Times New Roman" w:eastAsia="宋体"/>
-                <w:b/>
-                <w:sz w:val="15"/>
-              </w:rPr>
-              <w:t>运输层与性能设计</w:t>
-            </w:r>
-          </w:p>
-        </w:tc>
-        <w:tc>
-          <w:tcPr>
-            <w:tcW w:type="dxa" w:w="900"/>
-            <w:vAlign w:val="center"/>
-            <w:tcMar>
-              <w:top w:w="80" w:type="dxa"/>
-              <w:start w:w="70" w:type="dxa"/>
-              <w:bottom w:w="80" w:type="dxa"/>
-              <w:end w:w="70" w:type="dxa"/>
-            </w:tcMar>
-          </w:tcPr>
-          <w:p>
-            <w:pPr>
-              <w:spacing w:line="240" w:lineRule="auto" w:before="0" w:after="0"/>
-              <w:jc w:val="center"/>
-            </w:pPr>
-            <w:r>
-              <w:rPr>
-                <w:rFonts w:ascii="Times New Roman" w:hAnsi="Times New Roman" w:cs="Times New Roman" w:eastAsia="宋体"/>
-                <w:b w:val="0"/>
-                <w:sz w:val="15"/>
-              </w:rPr>
-              <w:t>15%</w:t>
-            </w:r>
-          </w:p>
-        </w:tc>
-        <w:tc>
-          <w:tcPr>
-            <w:tcW w:type="dxa" w:w="5100"/>
-            <w:vAlign w:val="center"/>
-            <w:tcMar>
-              <w:top w:w="80" w:type="dxa"/>
-              <w:start w:w="70" w:type="dxa"/>
-              <w:bottom w:w="80" w:type="dxa"/>
-              <w:end w:w="70" w:type="dxa"/>
-            </w:tcMar>
-          </w:tcPr>
-          <w:p>
-            <w:pPr>
-              <w:spacing w:line="240" w:lineRule="auto" w:before="0" w:after="0"/>
-              <w:jc w:val="left"/>
-            </w:pPr>
-            <w:r>
-              <w:rPr>
-                <w:rFonts w:ascii="Times New Roman" w:hAnsi="Times New Roman" w:cs="Times New Roman" w:eastAsia="宋体"/>
-                <w:b w:val="0"/>
-                <w:sz w:val="15"/>
-              </w:rPr>
-              <w:t>能依据应用特点说明TCP/UDP选择、连接和性能影响。</w:t>
-            </w:r>
-          </w:p>
-        </w:tc>
-        <w:tc>
-          <w:tcPr>
-            <w:tcW w:type="dxa" w:w="1354"/>
-            <w:vAlign w:val="center"/>
-            <w:tcMar>
-              <w:top w:w="80" w:type="dxa"/>
-              <w:start w:w="70" w:type="dxa"/>
-              <w:bottom w:w="80" w:type="dxa"/>
-              <w:end w:w="70" w:type="dxa"/>
-            </w:tcMar>
-          </w:tcPr>
-          <w:p>
-            <w:pPr>
-              <w:spacing w:line="240" w:lineRule="auto" w:before="0" w:after="0"/>
-              <w:jc w:val="center"/>
-            </w:pPr>
-            <w:r>
-              <w:rPr>
-                <w:rFonts w:ascii="Times New Roman" w:hAnsi="Times New Roman" w:cs="Times New Roman" w:eastAsia="宋体"/>
-                <w:b w:val="0"/>
-                <w:sz w:val="15"/>
-              </w:rPr>
-              <w:t>目标 1.4，2.4，3.4</w:t>
-            </w:r>
-          </w:p>
-        </w:tc>
-      </w:tr>
-      <w:tr>
-        <w:tc>
-          <w:tcPr>
-            <w:tcW w:type="dxa" w:w="1700"/>
-            <w:vAlign w:val="center"/>
-            <w:tcMar>
-              <w:top w:w="80" w:type="dxa"/>
-              <w:start w:w="70" w:type="dxa"/>
-              <w:bottom w:w="80" w:type="dxa"/>
-              <w:end w:w="70" w:type="dxa"/>
-            </w:tcMar>
-          </w:tcPr>
-          <w:p>
-            <w:pPr>
-              <w:spacing w:line="240" w:lineRule="auto" w:before="0" w:after="0"/>
-              <w:jc w:val="center"/>
-            </w:pPr>
-            <w:r>
-              <w:rPr>
-                <w:rFonts w:ascii="Times New Roman" w:hAnsi="Times New Roman" w:cs="Times New Roman" w:eastAsia="宋体"/>
-                <w:b/>
-                <w:sz w:val="15"/>
-              </w:rPr>
-              <w:t>应用服务与依赖关系</w:t>
-            </w:r>
-          </w:p>
-        </w:tc>
-        <w:tc>
-          <w:tcPr>
-            <w:tcW w:type="dxa" w:w="900"/>
-            <w:vAlign w:val="center"/>
-            <w:tcMar>
-              <w:top w:w="80" w:type="dxa"/>
-              <w:start w:w="70" w:type="dxa"/>
-              <w:bottom w:w="80" w:type="dxa"/>
-              <w:end w:w="70" w:type="dxa"/>
-            </w:tcMar>
-          </w:tcPr>
-          <w:p>
-            <w:pPr>
-              <w:spacing w:line="240" w:lineRule="auto" w:before="0" w:after="0"/>
-              <w:jc w:val="center"/>
-            </w:pPr>
-            <w:r>
-              <w:rPr>
-                <w:rFonts w:ascii="Times New Roman" w:hAnsi="Times New Roman" w:cs="Times New Roman" w:eastAsia="宋体"/>
-                <w:b w:val="0"/>
-                <w:sz w:val="15"/>
-              </w:rPr>
-              <w:t>15%</w:t>
-            </w:r>
-          </w:p>
-        </w:tc>
-        <w:tc>
-          <w:tcPr>
-            <w:tcW w:type="dxa" w:w="5100"/>
-            <w:vAlign w:val="center"/>
-            <w:tcMar>
-              <w:top w:w="80" w:type="dxa"/>
-              <w:start w:w="70" w:type="dxa"/>
-              <w:bottom w:w="80" w:type="dxa"/>
-              <w:end w:w="70" w:type="dxa"/>
-            </w:tcMar>
-          </w:tcPr>
-          <w:p>
-            <w:pPr>
-              <w:spacing w:line="240" w:lineRule="auto" w:before="0" w:after="0"/>
-              <w:jc w:val="left"/>
-            </w:pPr>
-            <w:r>
-              <w:rPr>
-                <w:rFonts w:ascii="Times New Roman" w:hAnsi="Times New Roman" w:cs="Times New Roman" w:eastAsia="宋体"/>
-                <w:b w:val="0"/>
-                <w:sz w:val="15"/>
-              </w:rPr>
-              <w:t>DNS、Web、DHCP或其他服务关系明确，端口和访问路径可验证。</w:t>
-            </w:r>
-          </w:p>
-        </w:tc>
-        <w:tc>
-          <w:tcPr>
-            <w:tcW w:type="dxa" w:w="1354"/>
-            <w:vAlign w:val="center"/>
-            <w:tcMar>
-              <w:top w:w="80" w:type="dxa"/>
-              <w:start w:w="70" w:type="dxa"/>
-              <w:bottom w:w="80" w:type="dxa"/>
-              <w:end w:w="70" w:type="dxa"/>
-            </w:tcMar>
-          </w:tcPr>
-          <w:p>
-            <w:pPr>
-              <w:spacing w:line="240" w:lineRule="auto" w:before="0" w:after="0"/>
-              <w:jc w:val="center"/>
-            </w:pPr>
-            <w:r>
-              <w:rPr>
-                <w:rFonts w:ascii="Times New Roman" w:hAnsi="Times New Roman" w:cs="Times New Roman" w:eastAsia="宋体"/>
-                <w:b w:val="0"/>
-                <w:sz w:val="15"/>
-              </w:rPr>
-              <w:t>目标 1.5，2.5，3.5</w:t>
-            </w:r>
-          </w:p>
-        </w:tc>
-      </w:tr>
-      <w:tr>
-        <w:tc>
-          <w:tcPr>
-            <w:tcW w:type="dxa" w:w="1700"/>
-            <w:vAlign w:val="center"/>
-            <w:tcMar>
-              <w:top w:w="80" w:type="dxa"/>
-              <w:start w:w="70" w:type="dxa"/>
-              <w:bottom w:w="80" w:type="dxa"/>
-              <w:end w:w="70" w:type="dxa"/>
-            </w:tcMar>
-          </w:tcPr>
-          <w:p>
-            <w:pPr>
-              <w:spacing w:line="240" w:lineRule="auto" w:before="0" w:after="0"/>
-              <w:jc w:val="center"/>
-            </w:pPr>
-            <w:r>
-              <w:rPr>
-                <w:rFonts w:ascii="Times New Roman" w:hAnsi="Times New Roman" w:cs="Times New Roman" w:eastAsia="宋体"/>
-                <w:b/>
-                <w:sz w:val="15"/>
-              </w:rPr>
-              <w:t>管理、安全与验收</w:t>
+              <w:t>故障分析、网络管理、安全与验收</w:t>
             </w:r>
           </w:p>
         </w:tc>
@@ -8091,7 +7663,7 @@
                 <w:b w:val="0"/>
                 <w:sz w:val="15"/>
               </w:rPr>
-              <w:t>监测、故障定位、访问控制、备份恢复和验证清单完整，并说明工具使用边界。</w:t>
+              <w:t>能按分层顺序定位故障，提出监测、访问控制、备份恢复和验证方法，并说明工具使用和安全边界。</w:t>
             </w:r>
           </w:p>
         </w:tc>
@@ -8145,7 +7717,7 @@
                 <w:b/>
                 <w:sz w:val="15"/>
               </w:rPr>
-              <w:t>合计</w:t>
+              <w:t>综合报告证据与技术文档</w:t>
             </w:r>
           </w:p>
         </w:tc>
@@ -8168,10 +7740,10 @@
             <w:r>
               <w:rPr>
                 <w:rFonts w:ascii="Times New Roman" w:hAnsi="Times New Roman" w:cs="Times New Roman" w:eastAsia="宋体"/>
-                <w:b/>
+                <w:b w:val="0"/>
                 <w:sz w:val="15"/>
               </w:rPr>
-              <w:t>100%</w:t>
+              <w:t>10%</w:t>
             </w:r>
           </w:p>
         </w:tc>
@@ -8194,9 +7766,10 @@
             <w:r>
               <w:rPr>
                 <w:rFonts w:ascii="Times New Roman" w:hAnsi="Times New Roman" w:cs="Times New Roman" w:eastAsia="宋体"/>
-                <w:b/>
+                <w:b w:val="0"/>
                 <w:sz w:val="15"/>
               </w:rPr>
+              <w:t>报告中的拓扑、地址表、协议分析、抓包或仿真证据、测试过程和引用完整，结论可复核。</w:t>
             </w:r>
           </w:p>
         </w:tc>
@@ -8219,159 +7792,10 @@
             <w:r>
               <w:rPr>
                 <w:rFonts w:ascii="Times New Roman" w:hAnsi="Times New Roman" w:cs="Times New Roman" w:eastAsia="宋体"/>
-                <w:b/>
+                <w:b w:val="0"/>
                 <w:sz w:val="15"/>
               </w:rPr>
-            </w:r>
-          </w:p>
-        </w:tc>
-      </w:tr>
-    </w:tbl>
-    <w:p>
-      <w:pPr>
-        <w:keepNext/>
-        <w:spacing w:line="283" w:lineRule="auto" w:before="60" w:after="20"/>
-      </w:pPr>
-      <w:r>
-        <w:rPr>
-          <w:rFonts w:ascii="Times New Roman" w:hAnsi="Times New Roman" w:eastAsia="宋体"/>
-          <w:b/>
-          <w:sz w:val="21"/>
-        </w:rPr>
-        <w:t>（4）个人核验与答辩评分标准</w:t>
-      </w:r>
-    </w:p>
-    <w:tbl>
-      <w:tblPr>
-        <w:tblW w:type="dxa" w:w="9054"/>
-        <w:jc w:val="center"/>
-        <w:tblLayout w:type="fixed"/>
-        <w:tblLook w:firstColumn="1" w:firstRow="1" w:lastColumn="0" w:lastRow="0" w:noHBand="0" w:noVBand="1" w:val="04A0"/>
-        <w:tblBorders>
-          <w:top w:val="single" w:sz="4" w:space="0" w:color="000000"/>
-          <w:left w:val="single" w:sz="4" w:space="0" w:color="000000"/>
-          <w:bottom w:val="single" w:sz="4" w:space="0" w:color="000000"/>
-          <w:right w:val="single" w:sz="4" w:space="0" w:color="000000"/>
-          <w:insideH w:val="single" w:sz="4" w:space="0" w:color="000000"/>
-          <w:insideV w:val="single" w:sz="4" w:space="0" w:color="000000"/>
-        </w:tblBorders>
-      </w:tblPr>
-      <w:tblGrid>
-        <w:gridCol w:w="1700"/>
-        <w:gridCol w:w="900"/>
-        <w:gridCol w:w="5100"/>
-        <w:gridCol w:w="1354"/>
-      </w:tblGrid>
-      <w:tr>
-        <w:trPr>
-          <w:tblHeader w:val="true"/>
-          <w:cantSplit/>
-        </w:trPr>
-        <w:tc>
-          <w:tcPr>
-            <w:tcW w:type="dxa" w:w="1700"/>
-            <w:tcMar>
-              <w:top w:w="80" w:type="dxa"/>
-              <w:start w:w="70" w:type="dxa"/>
-              <w:bottom w:w="80" w:type="dxa"/>
-              <w:end w:w="70" w:type="dxa"/>
-            </w:tcMar>
-            <w:vAlign w:val="center"/>
-          </w:tcPr>
-          <w:p>
-            <w:pPr>
-              <w:spacing w:line="269" w:lineRule="auto" w:before="0" w:after="0"/>
-              <w:jc w:val="center"/>
-            </w:pPr>
-            <w:r/>
-            <w:r>
-              <w:rPr>
-                <w:rFonts w:ascii="Times New Roman" w:hAnsi="Times New Roman" w:eastAsia="宋体"/>
-                <w:b/>
-                <w:sz w:val="17"/>
-              </w:rPr>
-              <w:t>考核内容</w:t>
-            </w:r>
-          </w:p>
-        </w:tc>
-        <w:tc>
-          <w:tcPr>
-            <w:tcW w:type="dxa" w:w="900"/>
-            <w:tcMar>
-              <w:top w:w="80" w:type="dxa"/>
-              <w:start w:w="70" w:type="dxa"/>
-              <w:bottom w:w="80" w:type="dxa"/>
-              <w:end w:w="70" w:type="dxa"/>
-            </w:tcMar>
-            <w:vAlign w:val="center"/>
-          </w:tcPr>
-          <w:p>
-            <w:pPr>
-              <w:spacing w:line="269" w:lineRule="auto" w:before="0" w:after="0"/>
-              <w:jc w:val="center"/>
-            </w:pPr>
-            <w:r/>
-            <w:r>
-              <w:rPr>
-                <w:rFonts w:ascii="Times New Roman" w:hAnsi="Times New Roman" w:eastAsia="宋体"/>
-                <w:b/>
-                <w:sz w:val="17"/>
-              </w:rPr>
-              <w:t>成绩占比</w:t>
-            </w:r>
-          </w:p>
-        </w:tc>
-        <w:tc>
-          <w:tcPr>
-            <w:tcW w:type="dxa" w:w="5100"/>
-            <w:tcMar>
-              <w:top w:w="80" w:type="dxa"/>
-              <w:start w:w="70" w:type="dxa"/>
-              <w:bottom w:w="80" w:type="dxa"/>
-              <w:end w:w="70" w:type="dxa"/>
-            </w:tcMar>
-            <w:vAlign w:val="center"/>
-          </w:tcPr>
-          <w:p>
-            <w:pPr>
-              <w:spacing w:line="269" w:lineRule="auto" w:before="0" w:after="0"/>
-              <w:jc w:val="center"/>
-            </w:pPr>
-            <w:r/>
-            <w:r>
-              <w:rPr>
-                <w:rFonts w:ascii="Times New Roman" w:hAnsi="Times New Roman" w:eastAsia="宋体"/>
-                <w:b/>
-                <w:sz w:val="17"/>
-              </w:rPr>
-              <w:t>评分要求</w:t>
-            </w:r>
-          </w:p>
-        </w:tc>
-        <w:tc>
-          <w:tcPr>
-            <w:tcW w:type="dxa" w:w="1354"/>
-            <w:tcMar>
-              <w:top w:w="80" w:type="dxa"/>
-              <w:start w:w="70" w:type="dxa"/>
-              <w:bottom w:w="80" w:type="dxa"/>
-              <w:end w:w="70" w:type="dxa"/>
-            </w:tcMar>
-            <w:vAlign w:val="center"/>
-          </w:tcPr>
-          <w:p>
-            <w:pPr>
-              <w:spacing w:line="269" w:lineRule="auto" w:before="0" w:after="0"/>
-              <w:jc w:val="center"/>
-            </w:pPr>
-            <w:r/>
-            <w:r>
-              <w:rPr>
-                <w:rFonts w:ascii="Times New Roman" w:hAnsi="Times New Roman" w:eastAsia="宋体"/>
-                <w:b/>
-                <w:sz w:val="17"/>
-              </w:rPr>
-              <w:t>课程目标</w:t>
+              <w:t>目标 2.1—2.6，3.1—3.6</w:t>
             </w:r>
           </w:p>
         </w:tc>
@@ -8399,219 +7823,7 @@
                 <w:b/>
                 <w:sz w:val="15"/>
               </w:rPr>
-              <w:t>网络分层与协议解释</w:t>
-            </w:r>
-          </w:p>
-        </w:tc>
-        <w:tc>
-          <w:tcPr>
-            <w:tcW w:type="dxa" w:w="900"/>
-            <w:vAlign w:val="center"/>
-            <w:tcMar>
-              <w:top w:w="80" w:type="dxa"/>
-              <w:start w:w="70" w:type="dxa"/>
-              <w:bottom w:w="80" w:type="dxa"/>
-              <w:end w:w="70" w:type="dxa"/>
-            </w:tcMar>
-          </w:tcPr>
-          <w:p>
-            <w:pPr>
-              <w:spacing w:line="240" w:lineRule="auto" w:before="0" w:after="0"/>
-              <w:jc w:val="center"/>
-            </w:pPr>
-            <w:r>
-              <w:rPr>
-                <w:rFonts w:ascii="Times New Roman" w:hAnsi="Times New Roman" w:cs="Times New Roman" w:eastAsia="宋体"/>
-                <w:b w:val="0"/>
-                <w:sz w:val="15"/>
-              </w:rPr>
-              <w:t>35%</w:t>
-            </w:r>
-          </w:p>
-        </w:tc>
-        <w:tc>
-          <w:tcPr>
-            <w:tcW w:type="dxa" w:w="5100"/>
-            <w:vAlign w:val="center"/>
-            <w:tcMar>
-              <w:top w:w="80" w:type="dxa"/>
-              <w:start w:w="70" w:type="dxa"/>
-              <w:bottom w:w="80" w:type="dxa"/>
-              <w:end w:w="70" w:type="dxa"/>
-            </w:tcMar>
-          </w:tcPr>
-          <w:p>
-            <w:pPr>
-              <w:spacing w:line="240" w:lineRule="auto" w:before="0" w:after="0"/>
-              <w:jc w:val="left"/>
-            </w:pPr>
-            <w:r>
-              <w:rPr>
-                <w:rFonts w:ascii="Times New Roman" w:hAnsi="Times New Roman" w:cs="Times New Roman" w:eastAsia="宋体"/>
-                <w:b w:val="0"/>
-                <w:sz w:val="15"/>
-              </w:rPr>
-              <w:t>能够独立解释本人方案中的分层、帧/包/段、地址、端口、路由和应用服务关系。</w:t>
-            </w:r>
-          </w:p>
-        </w:tc>
-        <w:tc>
-          <w:tcPr>
-            <w:tcW w:type="dxa" w:w="1354"/>
-            <w:vAlign w:val="center"/>
-            <w:tcMar>
-              <w:top w:w="80" w:type="dxa"/>
-              <w:start w:w="70" w:type="dxa"/>
-              <w:bottom w:w="80" w:type="dxa"/>
-              <w:end w:w="70" w:type="dxa"/>
-            </w:tcMar>
-          </w:tcPr>
-          <w:p>
-            <w:pPr>
-              <w:spacing w:line="240" w:lineRule="auto" w:before="0" w:after="0"/>
-              <w:jc w:val="center"/>
-            </w:pPr>
-            <w:r>
-              <w:rPr>
-                <w:rFonts w:ascii="Times New Roman" w:hAnsi="Times New Roman" w:cs="Times New Roman" w:eastAsia="宋体"/>
-                <w:b w:val="0"/>
-                <w:sz w:val="15"/>
-              </w:rPr>
-              <w:t>全部课程目标</w:t>
-            </w:r>
-          </w:p>
-        </w:tc>
-      </w:tr>
-      <w:tr>
-        <w:tc>
-          <w:tcPr>
-            <w:tcW w:type="dxa" w:w="1700"/>
-            <w:vAlign w:val="center"/>
-            <w:tcMar>
-              <w:top w:w="80" w:type="dxa"/>
-              <w:start w:w="70" w:type="dxa"/>
-              <w:bottom w:w="80" w:type="dxa"/>
-              <w:end w:w="70" w:type="dxa"/>
-            </w:tcMar>
-          </w:tcPr>
-          <w:p>
-            <w:pPr>
-              <w:spacing w:line="240" w:lineRule="auto" w:before="0" w:after="0"/>
-              <w:jc w:val="center"/>
-            </w:pPr>
-            <w:r>
-              <w:rPr>
-                <w:rFonts w:ascii="Times New Roman" w:hAnsi="Times New Roman" w:cs="Times New Roman" w:eastAsia="宋体"/>
-                <w:b/>
-                <w:sz w:val="15"/>
-              </w:rPr>
-              <w:t>故障定位与方案修改</w:t>
-            </w:r>
-          </w:p>
-        </w:tc>
-        <w:tc>
-          <w:tcPr>
-            <w:tcW w:type="dxa" w:w="900"/>
-            <w:vAlign w:val="center"/>
-            <w:tcMar>
-              <w:top w:w="80" w:type="dxa"/>
-              <w:start w:w="70" w:type="dxa"/>
-              <w:bottom w:w="80" w:type="dxa"/>
-              <w:end w:w="70" w:type="dxa"/>
-            </w:tcMar>
-          </w:tcPr>
-          <w:p>
-            <w:pPr>
-              <w:spacing w:line="240" w:lineRule="auto" w:before="0" w:after="0"/>
-              <w:jc w:val="center"/>
-            </w:pPr>
-            <w:r>
-              <w:rPr>
-                <w:rFonts w:ascii="Times New Roman" w:hAnsi="Times New Roman" w:cs="Times New Roman" w:eastAsia="宋体"/>
-                <w:b w:val="0"/>
-                <w:sz w:val="15"/>
-              </w:rPr>
-              <w:t>45%</w:t>
-            </w:r>
-          </w:p>
-        </w:tc>
-        <w:tc>
-          <w:tcPr>
-            <w:tcW w:type="dxa" w:w="5100"/>
-            <w:vAlign w:val="center"/>
-            <w:tcMar>
-              <w:top w:w="80" w:type="dxa"/>
-              <w:start w:w="70" w:type="dxa"/>
-              <w:bottom w:w="80" w:type="dxa"/>
-              <w:end w:w="70" w:type="dxa"/>
-            </w:tcMar>
-          </w:tcPr>
-          <w:p>
-            <w:pPr>
-              <w:spacing w:line="240" w:lineRule="auto" w:before="0" w:after="0"/>
-              <w:jc w:val="left"/>
-            </w:pPr>
-            <w:r>
-              <w:rPr>
-                <w:rFonts w:ascii="Times New Roman" w:hAnsi="Times New Roman" w:cs="Times New Roman" w:eastAsia="宋体"/>
-                <w:b w:val="0"/>
-                <w:sz w:val="15"/>
-              </w:rPr>
-              <w:t>针对给定故障或需求变化修改地址、路由、拓扑或服务关系，并说明验证步骤和安全风险。</w:t>
-            </w:r>
-          </w:p>
-        </w:tc>
-        <w:tc>
-          <w:tcPr>
-            <w:tcW w:type="dxa" w:w="1354"/>
-            <w:vAlign w:val="center"/>
-            <w:tcMar>
-              <w:top w:w="80" w:type="dxa"/>
-              <w:start w:w="70" w:type="dxa"/>
-              <w:bottom w:w="80" w:type="dxa"/>
-              <w:end w:w="70" w:type="dxa"/>
-            </w:tcMar>
-          </w:tcPr>
-          <w:p>
-            <w:pPr>
-              <w:spacing w:line="240" w:lineRule="auto" w:before="0" w:after="0"/>
-              <w:jc w:val="center"/>
-            </w:pPr>
-            <w:r>
-              <w:rPr>
-                <w:rFonts w:ascii="Times New Roman" w:hAnsi="Times New Roman" w:cs="Times New Roman" w:eastAsia="宋体"/>
-                <w:b w:val="0"/>
-                <w:sz w:val="15"/>
-              </w:rPr>
-              <w:t>全部课程目标</w:t>
-            </w:r>
-          </w:p>
-        </w:tc>
-      </w:tr>
-      <w:tr>
-        <w:tc>
-          <w:tcPr>
-            <w:tcW w:type="dxa" w:w="1700"/>
-            <w:vAlign w:val="center"/>
-            <w:tcMar>
-              <w:top w:w="80" w:type="dxa"/>
-              <w:start w:w="70" w:type="dxa"/>
-              <w:bottom w:w="80" w:type="dxa"/>
-              <w:end w:w="70" w:type="dxa"/>
-            </w:tcMar>
-          </w:tcPr>
-          <w:p>
-            <w:pPr>
-              <w:spacing w:line="240" w:lineRule="auto" w:before="0" w:after="0"/>
-              <w:jc w:val="center"/>
-            </w:pPr>
-            <w:r>
-              <w:rPr>
-                <w:rFonts w:ascii="Times New Roman" w:hAnsi="Times New Roman" w:cs="Times New Roman" w:eastAsia="宋体"/>
-                <w:b/>
-                <w:sz w:val="15"/>
-              </w:rPr>
-              <w:t>资料依据与个人贡献</w:t>
+              <w:t>个人核验、答辩与方案修改</w:t>
             </w:r>
           </w:p>
         </w:tc>
@@ -8663,7 +7875,7 @@
                 <w:b w:val="0"/>
                 <w:sz w:val="15"/>
               </w:rPr>
-              <w:t>能够指出教材、标准或官方文档依据，说明方案边界和个人完成内容。</w:t>
+              <w:t>能独立解释报告中的分层、协议、地址、路由和服务关系；针对给定故障或需求变化完成方案修改，并说明验证步骤、风险和个人贡献。</w:t>
             </w:r>
           </w:p>
         </w:tc>
@@ -8689,7 +7901,7 @@
                 <w:b w:val="0"/>
                 <w:sz w:val="15"/>
               </w:rPr>
-              <w:t>全部课程目标</w:t>
+              <w:t>目标 1.1—1.6，2.1—2.6，3.1—3.6</w:t>
             </w:r>
           </w:p>
         </w:tc>

</xml_diff>